<commit_message>
Align supplementary materials and documentation with revised manuscript
</commit_message>
<xml_diff>
--- a/supplementary-material/Supplementary Table S1.docx
+++ b/supplementary-material/Supplementary Table S1.docx
@@ -1220,6 +1220,7 @@
   <w:style w:type="paragraph" w:default="1" w:styleId="a">
     <w:name w:val="Normal"/>
     <w:qFormat/>
+    <w:rsid w:val="00FF4B4F"/>
     <w:rPr>
       <w:rFonts w:ascii="宋体" w:eastAsia="宋体" w:hAnsi="宋体" w:cs="宋体"/>
       <w:kern w:val="0"/>
@@ -1234,6 +1235,7 @@
     <w:link w:val="10"/>
     <w:uiPriority w:val="9"/>
     <w:qFormat/>
+    <w:rsid w:val="00FF4B4F"/>
     <w:pPr>
       <w:keepNext/>
       <w:keepLines/>
@@ -1256,6 +1258,7 @@
     <w:semiHidden/>
     <w:unhideWhenUsed/>
     <w:qFormat/>
+    <w:rsid w:val="00FF4B4F"/>
     <w:pPr>
       <w:keepNext/>
       <w:keepLines/>
@@ -1278,6 +1281,7 @@
     <w:semiHidden/>
     <w:unhideWhenUsed/>
     <w:qFormat/>
+    <w:rsid w:val="00FF4B4F"/>
     <w:pPr>
       <w:keepNext/>
       <w:keepLines/>
@@ -1300,6 +1304,7 @@
     <w:semiHidden/>
     <w:unhideWhenUsed/>
     <w:qFormat/>
+    <w:rsid w:val="00FF4B4F"/>
     <w:pPr>
       <w:keepNext/>
       <w:keepLines/>
@@ -1322,6 +1327,7 @@
     <w:semiHidden/>
     <w:unhideWhenUsed/>
     <w:qFormat/>
+    <w:rsid w:val="00FF4B4F"/>
     <w:pPr>
       <w:keepNext/>
       <w:keepLines/>
@@ -1342,6 +1348,7 @@
     <w:semiHidden/>
     <w:unhideWhenUsed/>
     <w:qFormat/>
+    <w:rsid w:val="00FF4B4F"/>
     <w:pPr>
       <w:keepNext/>
       <w:keepLines/>
@@ -1364,6 +1371,7 @@
     <w:semiHidden/>
     <w:unhideWhenUsed/>
     <w:qFormat/>
+    <w:rsid w:val="00FF4B4F"/>
     <w:pPr>
       <w:keepNext/>
       <w:keepLines/>
@@ -1386,6 +1394,7 @@
     <w:semiHidden/>
     <w:unhideWhenUsed/>
     <w:qFormat/>
+    <w:rsid w:val="00FF4B4F"/>
     <w:pPr>
       <w:keepNext/>
       <w:keepLines/>
@@ -1405,6 +1414,7 @@
     <w:semiHidden/>
     <w:unhideWhenUsed/>
     <w:qFormat/>
+    <w:rsid w:val="00FF4B4F"/>
     <w:pPr>
       <w:keepNext/>
       <w:keepLines/>
@@ -1447,6 +1457,7 @@
     <w:basedOn w:val="a0"/>
     <w:link w:val="1"/>
     <w:uiPriority w:val="9"/>
+    <w:rsid w:val="00FF4B4F"/>
     <w:rPr>
       <w:rFonts w:asciiTheme="majorHAnsi" w:eastAsiaTheme="majorEastAsia" w:hAnsiTheme="majorHAnsi" w:cstheme="majorBidi"/>
       <w:color w:val="2F5496" w:themeColor="accent1" w:themeShade="BF"/>
@@ -1460,6 +1471,7 @@
     <w:link w:val="2"/>
     <w:uiPriority w:val="9"/>
     <w:semiHidden/>
+    <w:rsid w:val="00FF4B4F"/>
     <w:rPr>
       <w:rFonts w:asciiTheme="majorHAnsi" w:eastAsiaTheme="majorEastAsia" w:hAnsiTheme="majorHAnsi" w:cstheme="majorBidi"/>
       <w:color w:val="2F5496" w:themeColor="accent1" w:themeShade="BF"/>
@@ -1473,6 +1485,7 @@
     <w:link w:val="3"/>
     <w:uiPriority w:val="9"/>
     <w:semiHidden/>
+    <w:rsid w:val="00FF4B4F"/>
     <w:rPr>
       <w:rFonts w:asciiTheme="majorHAnsi" w:eastAsiaTheme="majorEastAsia" w:hAnsiTheme="majorHAnsi" w:cstheme="majorBidi"/>
       <w:color w:val="2F5496" w:themeColor="accent1" w:themeShade="BF"/>
@@ -1486,6 +1499,7 @@
     <w:link w:val="4"/>
     <w:uiPriority w:val="9"/>
     <w:semiHidden/>
+    <w:rsid w:val="00FF4B4F"/>
     <w:rPr>
       <w:rFonts w:cstheme="majorBidi"/>
       <w:color w:val="2F5496" w:themeColor="accent1" w:themeShade="BF"/>
@@ -1499,6 +1513,7 @@
     <w:link w:val="5"/>
     <w:uiPriority w:val="9"/>
     <w:semiHidden/>
+    <w:rsid w:val="00FF4B4F"/>
     <w:rPr>
       <w:rFonts w:cstheme="majorBidi"/>
       <w:color w:val="2F5496" w:themeColor="accent1" w:themeShade="BF"/>
@@ -1511,6 +1526,7 @@
     <w:link w:val="6"/>
     <w:uiPriority w:val="9"/>
     <w:semiHidden/>
+    <w:rsid w:val="00FF4B4F"/>
     <w:rPr>
       <w:rFonts w:cstheme="majorBidi"/>
       <w:b/>
@@ -1524,6 +1540,7 @@
     <w:link w:val="7"/>
     <w:uiPriority w:val="9"/>
     <w:semiHidden/>
+    <w:rsid w:val="00FF4B4F"/>
     <w:rPr>
       <w:rFonts w:cstheme="majorBidi"/>
       <w:b/>
@@ -1537,6 +1554,7 @@
     <w:link w:val="8"/>
     <w:uiPriority w:val="9"/>
     <w:semiHidden/>
+    <w:rsid w:val="00FF4B4F"/>
     <w:rPr>
       <w:rFonts w:cstheme="majorBidi"/>
       <w:color w:val="595959" w:themeColor="text1" w:themeTint="A6"/>
@@ -1548,6 +1566,7 @@
     <w:link w:val="9"/>
     <w:uiPriority w:val="9"/>
     <w:semiHidden/>
+    <w:rsid w:val="00FF4B4F"/>
     <w:rPr>
       <w:rFonts w:eastAsiaTheme="majorEastAsia" w:cstheme="majorBidi"/>
       <w:color w:val="595959" w:themeColor="text1" w:themeTint="A6"/>
@@ -1560,6 +1579,7 @@
     <w:link w:val="a4"/>
     <w:uiPriority w:val="10"/>
     <w:qFormat/>
+    <w:rsid w:val="00FF4B4F"/>
     <w:pPr>
       <w:spacing w:after="80"/>
       <w:contextualSpacing/>
@@ -1578,6 +1598,7 @@
     <w:basedOn w:val="a0"/>
     <w:link w:val="a3"/>
     <w:uiPriority w:val="10"/>
+    <w:rsid w:val="00FF4B4F"/>
     <w:rPr>
       <w:rFonts w:asciiTheme="majorHAnsi" w:eastAsiaTheme="majorEastAsia" w:hAnsiTheme="majorHAnsi" w:cstheme="majorBidi"/>
       <w:spacing w:val="-10"/>
@@ -1593,6 +1614,7 @@
     <w:link w:val="a6"/>
     <w:uiPriority w:val="11"/>
     <w:qFormat/>
+    <w:rsid w:val="00FF4B4F"/>
     <w:pPr>
       <w:numPr>
         <w:ilvl w:val="1"/>
@@ -1613,6 +1635,7 @@
     <w:basedOn w:val="a0"/>
     <w:link w:val="a5"/>
     <w:uiPriority w:val="11"/>
+    <w:rsid w:val="00FF4B4F"/>
     <w:rPr>
       <w:rFonts w:asciiTheme="majorHAnsi" w:eastAsiaTheme="majorEastAsia" w:hAnsiTheme="majorHAnsi" w:cstheme="majorBidi"/>
       <w:color w:val="595959" w:themeColor="text1" w:themeTint="A6"/>
@@ -1628,6 +1651,7 @@
     <w:link w:val="a8"/>
     <w:uiPriority w:val="29"/>
     <w:qFormat/>
+    <w:rsid w:val="00FF4B4F"/>
     <w:pPr>
       <w:spacing w:before="160" w:after="160"/>
       <w:jc w:val="center"/>
@@ -1643,6 +1667,7 @@
     <w:basedOn w:val="a0"/>
     <w:link w:val="a7"/>
     <w:uiPriority w:val="29"/>
+    <w:rsid w:val="00FF4B4F"/>
     <w:rPr>
       <w:i/>
       <w:iCs/>
@@ -1654,6 +1679,7 @@
     <w:basedOn w:val="a"/>
     <w:uiPriority w:val="34"/>
     <w:qFormat/>
+    <w:rsid w:val="00FF4B4F"/>
     <w:pPr>
       <w:ind w:left="720"/>
       <w:contextualSpacing/>
@@ -1664,6 +1690,7 @@
     <w:basedOn w:val="a0"/>
     <w:uiPriority w:val="21"/>
     <w:qFormat/>
+    <w:rsid w:val="00FF4B4F"/>
     <w:rPr>
       <w:i/>
       <w:iCs/>
@@ -1677,6 +1704,7 @@
     <w:link w:val="ac"/>
     <w:uiPriority w:val="30"/>
     <w:qFormat/>
+    <w:rsid w:val="00FF4B4F"/>
     <w:pPr>
       <w:pBdr>
         <w:top w:val="single" w:sz="4" w:space="10" w:color="2F5496" w:themeColor="accent1" w:themeShade="BF"/>
@@ -1697,6 +1725,7 @@
     <w:basedOn w:val="a0"/>
     <w:link w:val="ab"/>
     <w:uiPriority w:val="30"/>
+    <w:rsid w:val="00FF4B4F"/>
     <w:rPr>
       <w:i/>
       <w:iCs/>
@@ -1708,6 +1737,7 @@
     <w:basedOn w:val="a0"/>
     <w:uiPriority w:val="32"/>
     <w:qFormat/>
+    <w:rsid w:val="00FF4B4F"/>
     <w:rPr>
       <w:b/>
       <w:bCs/>

</xml_diff>